<commit_message>
feat: add branding, generate architecture doc, update all interview docs
- Add "Wayesu Community Research Organisation Ltd" branding to Android
  DashboardScreen and web App.tsx footer
- Generate HeatShield_Agri_Architecture document (PDF + DOCX) covering
  full platform architecture (Web, Android, USSD, ML pipeline)
- Update Deployment_Readiness_Strategy_Report: XGBoost→Random Forest,
  Android readiness 4.5→6.5/10, Web 7.5→8.5/10, ML now deployed
- Update HeatShield_Agri_Pitch_Deck: XGBoost→Random Forest, full org
  name, Raymond Reuel Wayesu
- Update HeatShield_Agri_Budget: add org name
- Update HeatShield_QA_Professional: XGBoost→Random Forest, org attribution
- Update HeatShield_QA_Talking_Points: XGBoost→Random Forest, org attribution
- Add document generation scripts for future regeneration

https://claude.ai/code/session_01Y9ai8kpHrRM5iqa3hXDN3v
</commit_message>
<xml_diff>
--- a/docs/HeatShield_QA_Professional.docx
+++ b/docs/HeatShield_QA_Professional.docx
@@ -111,7 +111,7 @@
                 <w:b/>
                 <w:bCs/>
               </w:rPr>
-              <w:t xml:space="preserve">Prepared for: Raymond Wayesu</w:t>
+              <w:t>Prepared for: Raymond Reuel Wayesu</w:t>
             </w:r>
           </w:p>
           <w:p>
@@ -267,7 +267,7 @@
                 <w:sz w:val="24"/>
                 <w:szCs w:val="24"/>
               </w:rPr>
-              <w:t xml:space="preserve">Why XGBoost with physics-informed neural network?</w:t>
+              <w:t>Why Random Forest with physics-based ISO 7243 model?</w:t>
             </w:r>
           </w:p>
         </w:tc>
@@ -298,7 +298,7 @@
                 <w:sz w:val="22"/>
                 <w:szCs w:val="22"/>
               </w:rPr>
-              <w:t xml:space="preserve">This hybrid approach captures the best of both worlds. XGBoost excels at handling tabular data with complex feature interactions (temperature, humidity, wind, terrain), while the physics layer ensures predictions respect known thermodynamic relationships. The physics constraint prevents the model from making physically impossible predictions—a common failure mode of pure ML approaches. Crucially, XGBoost is computationally efficient and deployable without expensive GPU infrastructure, which is essential for sustainable operations in our context.</w:t>
+              <w:t>This hybrid approach captures the best of both worlds. Random Forest excels at handling tabular data with complex feature interactions (temperature, humidity, wind, terrain) using an ensemble of decision trees, while the physics-based ISO 7243 layer ensures predictions respect known thermodynamic relationships. The Random Forest models are already deployed on Android via ONNX Runtime. The physics constraint prevents the model from making physically impossible predictions—a common failure mode of pure ML approaches. Crucially, Random Forest is computationally efficient and deployable without expensive GPU infrastructure, which is essential for sustainable operations in our context.</w:t>
             </w:r>
           </w:p>
         </w:tc>
@@ -1575,7 +1575,7 @@
                 <w:sz w:val="22"/>
                 <w:szCs w:val="22"/>
               </w:rPr>
-              <w:t xml:space="preserve">Lightweight by design: XGBoost and spatial interpolation, not GPU-intensive deep learning. Pre-calculated forecasts are cached and served, avoiding on-demand inference for each request. The environmental cost is negligible compared to climate adaptation benefits delivered—we're helping millions adapt to climate change. Cloud providers (Vercel, AWS) have renewable energy commitments. We'll measure and report carbon footprint annually, and explore edge computing as we scale.</w:t>
+              <w:t>Lightweight by design: Random Forest ensemble models and spatial interpolation, not GPU-intensive deep learning. Pre-calculated forecasts are cached and served, avoiding on-demand inference for each request. The environmental cost is negligible compared to climate adaptation benefits delivered—we're helping millions adapt to climate change. Cloud providers (Vercel, AWS) have renewable energy commitments. We'll measure and report carbon footprint annually, and explore edge computing as we scale.</w:t>
             </w:r>
           </w:p>
         </w:tc>
@@ -2338,9 +2338,25 @@
         <w:t xml:space="preserve">Remember: You've built something real. Show them.</w:t>
       </w:r>
     </w:p>
+    <w:p>
+      <w:pPr>
+        <w:jc w:val="center"/>
+      </w:pPr>
+      <w:r>
+        <w:rPr>
+          <w:i/>
+          <w:color w:val="646464"/>
+          <w:sz w:val="18"/>
+        </w:rPr>
+        <w:br/>
+        <w:t>Prepared by Wayesu Community Research Organisation Ltd</w:t>
+      </w:r>
+    </w:p>
     <w:sectPr>
       <w:headerReference w:type="default" r:id="rId7"/>
       <w:footerReference w:type="default" r:id="rId8"/>
+      <w:headerReference w:type="first" r:id="rId10"/>
+      <w:footerReference w:type="first" r:id="rId11"/>
       <w:pgSz w:w="12240" w:h="15840" w:orient="portrait"/>
       <w:pgMar w:top="1080" w:right="1080" w:bottom="1080" w:left="1080" w:header="708" w:footer="708" w:gutter="0"/>
       <w:pgNumType/>
@@ -2428,6 +2444,16 @@
 </w:ftr>
 </file>
 
+<file path=word/footer2.xml><?xml version="1.0" encoding="utf-8"?>
+<w:ftr xmlns:m="http://schemas.openxmlformats.org/officeDocument/2006/math" xmlns:mc="http://schemas.openxmlformats.org/markup-compatibility/2006" xmlns:mo="http://schemas.microsoft.com/office/mac/office/2008/main" xmlns:mv="urn:schemas-microsoft-com:mac:vml" xmlns:o="urn:schemas-microsoft-com:office:office" xmlns:r="http://schemas.openxmlformats.org/officeDocument/2006/relationships" xmlns:v="urn:schemas-microsoft-com:vml" xmlns:w10="urn:schemas-microsoft-com:office:word" xmlns:w14="http://schemas.microsoft.com/office/word/2010/wordml" xmlns:w="http://schemas.openxmlformats.org/wordprocessingml/2006/main" xmlns:wne="http://schemas.microsoft.com/office/word/2006/wordml" xmlns:wp14="http://schemas.microsoft.com/office/word/2010/wordprocessingDrawing" xmlns:wp="http://schemas.openxmlformats.org/drawingml/2006/wordprocessingDrawing" xmlns:wpc="http://schemas.microsoft.com/office/word/2010/wordprocessingCanvas" xmlns:wpg="http://schemas.microsoft.com/office/word/2010/wordprocessingGroup" xmlns:wpi="http://schemas.microsoft.com/office/word/2010/wordprocessingInk" xmlns:wps="http://schemas.microsoft.com/office/word/2010/wordprocessingShape" mc:Ignorable="w14 wp14">
+  <w:p>
+    <w:pPr>
+      <w:pStyle w:val="Footer"/>
+    </w:pPr>
+  </w:p>
+</w:ftr>
+</file>
+
 <file path=word/footnotes.xml><?xml version="1.0" encoding="utf-8"?>
 <w:footnotes xmlns:wpc="http://schemas.microsoft.com/office/word/2010/wordprocessingCanvas" xmlns:mc="http://schemas.openxmlformats.org/markup-compatibility/2006" xmlns:o="urn:schemas-microsoft-com:office:office" xmlns:r="http://schemas.openxmlformats.org/officeDocument/2006/relationships" xmlns:m="http://schemas.openxmlformats.org/officeDocument/2006/math" xmlns:v="urn:schemas-microsoft-com:vml" xmlns:wp14="http://schemas.microsoft.com/office/word/2010/wordprocessingDrawing" xmlns:wp="http://schemas.openxmlformats.org/drawingml/2006/wordprocessingDrawing" xmlns:w10="urn:schemas-microsoft-com:office:word" xmlns:w="http://schemas.openxmlformats.org/wordprocessingml/2006/main" xmlns:w14="http://schemas.microsoft.com/office/word/2010/wordml" xmlns:w15="http://schemas.microsoft.com/office/word/2012/wordml" xmlns:wpg="http://schemas.microsoft.com/office/word/2010/wordprocessingGroup" xmlns:wpi="http://schemas.microsoft.com/office/word/2010/wordprocessingInk" xmlns:wne="http://schemas.microsoft.com/office/word/2006/wordml" xmlns:wps="http://schemas.microsoft.com/office/word/2010/wordprocessingShape" mc:Ignorable="w14 w15 wp14">
   <w:footnote w:type="separator" w:id="-1">
@@ -2484,6 +2510,16 @@
       </w:rPr>
       <w:t xml:space="preserve">HeatShield Agri | Interview Q&amp;A Reference</w:t>
     </w:r>
+  </w:p>
+</w:hdr>
+</file>
+
+<file path=word/header2.xml><?xml version="1.0" encoding="utf-8"?>
+<w:hdr xmlns:m="http://schemas.openxmlformats.org/officeDocument/2006/math" xmlns:mc="http://schemas.openxmlformats.org/markup-compatibility/2006" xmlns:mo="http://schemas.microsoft.com/office/mac/office/2008/main" xmlns:mv="urn:schemas-microsoft-com:mac:vml" xmlns:o="urn:schemas-microsoft-com:office:office" xmlns:r="http://schemas.openxmlformats.org/officeDocument/2006/relationships" xmlns:v="urn:schemas-microsoft-com:vml" xmlns:w10="urn:schemas-microsoft-com:office:word" xmlns:w14="http://schemas.microsoft.com/office/word/2010/wordml" xmlns:w="http://schemas.openxmlformats.org/wordprocessingml/2006/main" xmlns:wne="http://schemas.microsoft.com/office/word/2006/wordml" xmlns:wp14="http://schemas.microsoft.com/office/word/2010/wordprocessingDrawing" xmlns:wp="http://schemas.openxmlformats.org/drawingml/2006/wordprocessingDrawing" xmlns:wpc="http://schemas.microsoft.com/office/word/2010/wordprocessingCanvas" xmlns:wpg="http://schemas.microsoft.com/office/word/2010/wordprocessingGroup" xmlns:wpi="http://schemas.microsoft.com/office/word/2010/wordprocessingInk" xmlns:wps="http://schemas.microsoft.com/office/word/2010/wordprocessingShape" mc:Ignorable="w14 wp14">
+  <w:p>
+    <w:pPr>
+      <w:pStyle w:val="Header"/>
+    </w:pPr>
   </w:p>
 </w:hdr>
 </file>

</xml_diff>